<commit_message>
fix: menu options were validated
</commit_message>
<xml_diff>
--- a/doc/Requerimientos Funcionales.docx
+++ b/doc/Requerimientos Funcionales.docx
@@ -2371,7 +2371,19 @@
         <w:t>.</w:t>
       </w:r>
     </w:p>
-    <w:p/>
+    <w:p>
+      <w:pPr>
+        <w:spacing w:before="100" w:beforeAutospacing="1" w:after="100" w:afterAutospacing="1" w:line="240" w:lineRule="auto"/>
+        <w:rPr>
+          <w:rFonts w:ascii="Times New Roman" w:eastAsia="Times New Roman" w:hAnsi="Times New Roman" w:cs="Times New Roman"/>
+          <w:kern w:val="0"/>
+          <w:sz w:val="24"/>
+          <w:szCs w:val="24"/>
+          <w:lang w:eastAsia="es-CO"/>
+          <w14:ligatures w14:val="none"/>
+        </w:rPr>
+      </w:pPr>
+    </w:p>
     <w:p>
       <w:pPr>
         <w:rPr>
@@ -2398,7 +2410,21 @@
           <w:b/>
           <w:bCs/>
         </w:rPr>
-        <w:t>4.2: Actualizar libros</w:t>
+        <w:t>4.</w:t>
+      </w:r>
+      <w:r>
+        <w:rPr>
+          <w:b/>
+          <w:bCs/>
+        </w:rPr>
+        <w:t>2</w:t>
+      </w:r>
+      <w:r>
+        <w:rPr>
+          <w:b/>
+          <w:bCs/>
+        </w:rPr>
+        <w:t>: Eliminar libros</w:t>
       </w:r>
     </w:p>
     <w:p>
@@ -2418,10 +2444,7 @@
     </w:p>
     <w:p>
       <w:r>
-        <w:t xml:space="preserve">El sistema debe permitir a los administradores </w:t>
-      </w:r>
-      <w:r>
-        <w:t>actualizar libros.</w:t>
+        <w:t>El sistema debe permitir a los administradores eliminar libros.</w:t>
       </w:r>
     </w:p>
     <w:p>
@@ -2446,6 +2469,10 @@
           <w:ilvl w:val="0"/>
           <w:numId w:val="2"/>
         </w:numPr>
+        <w:rPr>
+          <w:b/>
+          <w:bCs/>
+        </w:rPr>
       </w:pPr>
       <w:r>
         <w:lastRenderedPageBreak/>
@@ -2474,13 +2501,9 @@
           <w:ilvl w:val="0"/>
           <w:numId w:val="2"/>
         </w:numPr>
-        <w:rPr>
-          <w:b/>
-          <w:bCs/>
-        </w:rPr>
-      </w:pPr>
-      <w:r>
-        <w:t>El administrador debe tener la sesión iniciada.</w:t>
+      </w:pPr>
+      <w:r>
+        <w:t>El administrador debe tener la sesión activa.</w:t>
       </w:r>
     </w:p>
     <w:p>
@@ -2496,13 +2519,120 @@
         </w:rPr>
       </w:pPr>
       <w:r>
-        <w:t xml:space="preserve">El libro debe </w:t>
-      </w:r>
-      <w:r>
-        <w:t>estar registrado</w:t>
-      </w:r>
-      <w:r>
-        <w:t xml:space="preserve"> en el sistema</w:t>
+        <w:t>El libro debe estar registrado.</w:t>
+      </w:r>
+    </w:p>
+    <w:p>
+      <w:pPr>
+        <w:rPr>
+          <w:b/>
+          <w:bCs/>
+        </w:rPr>
+      </w:pPr>
+      <w:r>
+        <w:rPr>
+          <w:b/>
+          <w:bCs/>
+        </w:rPr>
+        <w:t>Flujo</w:t>
+      </w:r>
+      <w:r>
+        <w:rPr>
+          <w:b/>
+          <w:bCs/>
+        </w:rPr>
+        <w:t xml:space="preserve"> principal</w:t>
+      </w:r>
+      <w:r>
+        <w:rPr>
+          <w:b/>
+          <w:bCs/>
+        </w:rPr>
+        <w:t>:</w:t>
+      </w:r>
+    </w:p>
+    <w:p>
+      <w:pPr>
+        <w:pStyle w:val="Prrafodelista"/>
+        <w:numPr>
+          <w:ilvl w:val="0"/>
+          <w:numId w:val="39"/>
+        </w:numPr>
+      </w:pPr>
+      <w:r>
+        <w:t xml:space="preserve">El administrador accede a la </w:t>
+      </w:r>
+      <w:r>
+        <w:t>página</w:t>
+      </w:r>
+      <w:r>
+        <w:t xml:space="preserve"> principal.</w:t>
+      </w:r>
+    </w:p>
+    <w:p>
+      <w:pPr>
+        <w:pStyle w:val="Prrafodelista"/>
+        <w:numPr>
+          <w:ilvl w:val="0"/>
+          <w:numId w:val="39"/>
+        </w:numPr>
+      </w:pPr>
+      <w:r>
+        <w:t>El administrador busca el libro.</w:t>
+      </w:r>
+    </w:p>
+    <w:p>
+      <w:pPr>
+        <w:pStyle w:val="Prrafodelista"/>
+        <w:numPr>
+          <w:ilvl w:val="0"/>
+          <w:numId w:val="39"/>
+        </w:numPr>
+      </w:pPr>
+      <w:r>
+        <w:t>El administrador selecciona el libro.</w:t>
+      </w:r>
+    </w:p>
+    <w:p>
+      <w:pPr>
+        <w:pStyle w:val="Prrafodelista"/>
+        <w:numPr>
+          <w:ilvl w:val="0"/>
+          <w:numId w:val="39"/>
+        </w:numPr>
+      </w:pPr>
+      <w:r>
+        <w:t>El administrador selecciona el botón Eliminar.</w:t>
+      </w:r>
+    </w:p>
+    <w:p>
+      <w:pPr>
+        <w:pStyle w:val="Prrafodelista"/>
+        <w:numPr>
+          <w:ilvl w:val="0"/>
+          <w:numId w:val="39"/>
+        </w:numPr>
+      </w:pPr>
+      <w:r>
+        <w:t xml:space="preserve">El sistema </w:t>
+      </w:r>
+      <w:r>
+        <w:t>pregunta al administrador.</w:t>
+      </w:r>
+    </w:p>
+    <w:p>
+      <w:pPr>
+        <w:pStyle w:val="Prrafodelista"/>
+        <w:numPr>
+          <w:ilvl w:val="0"/>
+          <w:numId w:val="39"/>
+        </w:numPr>
+      </w:pPr>
+      <w:r>
+        <w:t xml:space="preserve">El administrador confirma la </w:t>
+      </w:r>
+      <w:r>
+        <w:t>eliminación</w:t>
       </w:r>
       <w:r>
         <w:t>.</w:t>
@@ -2510,149 +2640,26 @@
     </w:p>
     <w:p>
       <w:pPr>
-        <w:rPr>
-          <w:b/>
-          <w:bCs/>
-        </w:rPr>
-      </w:pPr>
-      <w:r>
-        <w:rPr>
-          <w:b/>
-          <w:bCs/>
-        </w:rPr>
-        <w:t>Flujo principal:</w:t>
-      </w:r>
-    </w:p>
-    <w:p>
-      <w:pPr>
-        <w:pStyle w:val="Prrafodelista"/>
-        <w:numPr>
-          <w:ilvl w:val="0"/>
-          <w:numId w:val="35"/>
-        </w:numPr>
-      </w:pPr>
-      <w:r>
-        <w:t xml:space="preserve">El administrador accede a la </w:t>
-      </w:r>
-      <w:r>
-        <w:t>página</w:t>
-      </w:r>
-      <w:r>
-        <w:t xml:space="preserve"> de inicio.</w:t>
-      </w:r>
-    </w:p>
-    <w:p>
-      <w:pPr>
-        <w:pStyle w:val="Prrafodelista"/>
-        <w:numPr>
-          <w:ilvl w:val="0"/>
-          <w:numId w:val="35"/>
-        </w:numPr>
-      </w:pPr>
-      <w:r>
-        <w:t>El administrador</w:t>
-      </w:r>
-      <w:r>
-        <w:t xml:space="preserve"> busca el libro</w:t>
-      </w:r>
-      <w:r>
-        <w:t>.</w:t>
-      </w:r>
-    </w:p>
-    <w:p>
-      <w:pPr>
-        <w:pStyle w:val="Prrafodelista"/>
-        <w:numPr>
-          <w:ilvl w:val="0"/>
-          <w:numId w:val="35"/>
-        </w:numPr>
-      </w:pPr>
-      <w:r>
-        <w:t>El administrador selecciona el libro.</w:t>
-      </w:r>
-    </w:p>
-    <w:p>
-      <w:pPr>
-        <w:pStyle w:val="Prrafodelista"/>
-        <w:numPr>
-          <w:ilvl w:val="0"/>
-          <w:numId w:val="35"/>
-        </w:numPr>
-      </w:pPr>
-      <w:r>
-        <w:t>El administrador accede a la página de actualización.</w:t>
-      </w:r>
-    </w:p>
-    <w:p>
-      <w:pPr>
-        <w:pStyle w:val="Prrafodelista"/>
-        <w:numPr>
-          <w:ilvl w:val="0"/>
-          <w:numId w:val="35"/>
-        </w:numPr>
-      </w:pPr>
-      <w:r>
-        <w:t xml:space="preserve">El administrador </w:t>
-      </w:r>
-      <w:r>
-        <w:t>actualiza la información del libro</w:t>
-      </w:r>
-      <w:r>
-        <w:t>.</w:t>
-      </w:r>
-    </w:p>
-    <w:p>
-      <w:pPr>
-        <w:pStyle w:val="Prrafodelista"/>
-        <w:numPr>
-          <w:ilvl w:val="0"/>
-          <w:numId w:val="35"/>
-        </w:numPr>
-      </w:pPr>
-      <w:r>
-        <w:t>El administrador selecciona el botón Actualizar.</w:t>
-      </w:r>
-    </w:p>
-    <w:p>
-      <w:pPr>
-        <w:pStyle w:val="Prrafodelista"/>
-        <w:numPr>
-          <w:ilvl w:val="0"/>
-          <w:numId w:val="35"/>
-        </w:numPr>
-      </w:pPr>
-      <w:r>
-        <w:t>El sistema valida los datos.</w:t>
-      </w:r>
-    </w:p>
-    <w:p>
-      <w:pPr>
-        <w:pStyle w:val="Prrafodelista"/>
-        <w:numPr>
-          <w:ilvl w:val="0"/>
-          <w:numId w:val="35"/>
-        </w:numPr>
-      </w:pPr>
-      <w:r>
-        <w:t>El sistema actualiza</w:t>
-      </w:r>
-      <w:r>
-        <w:t xml:space="preserve"> la información del libro</w:t>
-      </w:r>
-      <w:r>
-        <w:t>.</w:t>
-      </w:r>
-    </w:p>
-    <w:p>
-      <w:pPr>
-        <w:pStyle w:val="Prrafodelista"/>
-        <w:numPr>
-          <w:ilvl w:val="0"/>
-          <w:numId w:val="35"/>
-        </w:numPr>
-      </w:pPr>
-      <w:r>
-        <w:t>El sistema muestra mensaje de actualización exitosa.</w:t>
+        <w:pStyle w:val="Prrafodelista"/>
+        <w:numPr>
+          <w:ilvl w:val="0"/>
+          <w:numId w:val="39"/>
+        </w:numPr>
+      </w:pPr>
+      <w:r>
+        <w:t>El sistema elimina el libro.</w:t>
+      </w:r>
+    </w:p>
+    <w:p>
+      <w:pPr>
+        <w:pStyle w:val="Prrafodelista"/>
+        <w:numPr>
+          <w:ilvl w:val="0"/>
+          <w:numId w:val="39"/>
+        </w:numPr>
+      </w:pPr>
+      <w:r>
+        <w:t>El sistema muestra mensaje de eliminación exitosa.</w:t>
       </w:r>
     </w:p>
     <w:p>
@@ -2689,55 +2696,43 @@
           <w:b/>
           <w:bCs/>
         </w:rPr>
-        <w:t>Datos inválidos</w:t>
-      </w:r>
-    </w:p>
-    <w:p>
-      <w:pPr>
-        <w:pStyle w:val="Prrafodelista"/>
-        <w:numPr>
-          <w:ilvl w:val="0"/>
-          <w:numId w:val="66"/>
-        </w:numPr>
-      </w:pPr>
-      <w:r>
-        <w:t>El administrador ingresa datos incorrectos.</w:t>
-      </w:r>
-    </w:p>
-    <w:p>
-      <w:pPr>
-        <w:pStyle w:val="Prrafodelista"/>
-        <w:numPr>
-          <w:ilvl w:val="0"/>
-          <w:numId w:val="66"/>
-        </w:numPr>
-      </w:pPr>
-      <w:r>
-        <w:t>El sistema detecta la inconsistencia.</w:t>
-      </w:r>
-    </w:p>
-    <w:p>
-      <w:pPr>
-        <w:pStyle w:val="Prrafodelista"/>
-        <w:numPr>
-          <w:ilvl w:val="0"/>
-          <w:numId w:val="66"/>
-        </w:numPr>
-      </w:pPr>
-      <w:r>
-        <w:t>El sistema muestra un mensaje de error.</w:t>
-      </w:r>
-    </w:p>
-    <w:p>
-      <w:pPr>
-        <w:pStyle w:val="Prrafodelista"/>
-        <w:numPr>
-          <w:ilvl w:val="0"/>
-          <w:numId w:val="66"/>
-        </w:numPr>
-      </w:pPr>
-      <w:r>
-        <w:t>El sistema solicita ingresar nuevamente los datos.</w:t>
+        <w:t>Cancelación de la eliminación</w:t>
+      </w:r>
+    </w:p>
+    <w:p>
+      <w:pPr>
+        <w:pStyle w:val="Prrafodelista"/>
+        <w:numPr>
+          <w:ilvl w:val="0"/>
+          <w:numId w:val="68"/>
+        </w:numPr>
+      </w:pPr>
+      <w:r>
+        <w:t>El sistema solicita confirmación antes de eliminar el libro.</w:t>
+      </w:r>
+    </w:p>
+    <w:p>
+      <w:pPr>
+        <w:pStyle w:val="Prrafodelista"/>
+        <w:numPr>
+          <w:ilvl w:val="0"/>
+          <w:numId w:val="68"/>
+        </w:numPr>
+      </w:pPr>
+      <w:r>
+        <w:t>El administrador cancela la operación.</w:t>
+      </w:r>
+    </w:p>
+    <w:p>
+      <w:pPr>
+        <w:pStyle w:val="Prrafodelista"/>
+        <w:numPr>
+          <w:ilvl w:val="0"/>
+          <w:numId w:val="68"/>
+        </w:numPr>
+      </w:pPr>
+      <w:r>
+        <w:t>El sistema cancela el proceso y regresa al menú principal.</w:t>
       </w:r>
     </w:p>
     <w:p>
@@ -2760,18 +2755,17 @@
         <w:pStyle w:val="Prrafodelista"/>
         <w:numPr>
           <w:ilvl w:val="0"/>
-          <w:numId w:val="36"/>
-        </w:numPr>
-        <w:rPr>
-          <w:b/>
-          <w:bCs/>
-        </w:rPr>
-      </w:pPr>
-      <w:r>
-        <w:t>Información actualizada del libro en el sistema</w:t>
-      </w:r>
-      <w:r>
-        <w:t>.</w:t>
+          <w:numId w:val="40"/>
+        </w:numPr>
+      </w:pPr>
+      <w:r>
+        <w:t>El libro es</w:t>
+      </w:r>
+      <w:r>
+        <w:t xml:space="preserve"> eliminado</w:t>
+      </w:r>
+      <w:r>
+        <w:t xml:space="preserve"> del sistema.</w:t>
       </w:r>
     </w:p>
     <w:p>
@@ -2794,435 +2788,6 @@
         <w:pStyle w:val="Prrafodelista"/>
         <w:numPr>
           <w:ilvl w:val="0"/>
-          <w:numId w:val="67"/>
-        </w:numPr>
-      </w:pPr>
-      <w:r>
-        <w:t>El sistema debe permitir modificar la información de libros registrados.</w:t>
-      </w:r>
-    </w:p>
-    <w:p>
-      <w:pPr>
-        <w:pStyle w:val="Prrafodelista"/>
-        <w:numPr>
-          <w:ilvl w:val="0"/>
-          <w:numId w:val="67"/>
-        </w:numPr>
-      </w:pPr>
-      <w:r>
-        <w:t>El sistema debe validar los datos antes de actualizar.</w:t>
-      </w:r>
-    </w:p>
-    <w:p>
-      <w:pPr>
-        <w:pStyle w:val="Prrafodelista"/>
-        <w:numPr>
-          <w:ilvl w:val="0"/>
-          <w:numId w:val="67"/>
-        </w:numPr>
-      </w:pPr>
-      <w:r>
-        <w:t>El sistema debe mostrar mensajes de confirmación o error.</w:t>
-      </w:r>
-    </w:p>
-    <w:p>
-      <w:pPr>
-        <w:rPr>
-          <w:b/>
-          <w:bCs/>
-        </w:rPr>
-      </w:pPr>
-    </w:p>
-    <w:p>
-      <w:pPr>
-        <w:rPr>
-          <w:b/>
-          <w:bCs/>
-        </w:rPr>
-      </w:pPr>
-      <w:r>
-        <w:rPr>
-          <w:b/>
-          <w:bCs/>
-        </w:rPr>
-        <w:t xml:space="preserve">ERF – </w:t>
-      </w:r>
-      <w:r>
-        <w:rPr>
-          <w:b/>
-          <w:bCs/>
-        </w:rPr>
-        <w:t>00</w:t>
-      </w:r>
-      <w:r>
-        <w:rPr>
-          <w:b/>
-          <w:bCs/>
-        </w:rPr>
-        <w:t>4.3: Eliminar libros</w:t>
-      </w:r>
-    </w:p>
-    <w:p>
-      <w:pPr>
-        <w:rPr>
-          <w:b/>
-          <w:bCs/>
-        </w:rPr>
-      </w:pPr>
-      <w:r>
-        <w:rPr>
-          <w:b/>
-          <w:bCs/>
-        </w:rPr>
-        <w:t>Descripción:</w:t>
-      </w:r>
-    </w:p>
-    <w:p>
-      <w:r>
-        <w:t>El sistema debe permitir a los administradores eliminar libros.</w:t>
-      </w:r>
-    </w:p>
-    <w:p>
-      <w:pPr>
-        <w:rPr>
-          <w:b/>
-          <w:bCs/>
-        </w:rPr>
-      </w:pPr>
-      <w:r>
-        <w:rPr>
-          <w:b/>
-          <w:bCs/>
-        </w:rPr>
-        <w:t>Actor:</w:t>
-      </w:r>
-    </w:p>
-    <w:p>
-      <w:pPr>
-        <w:pStyle w:val="Prrafodelista"/>
-        <w:numPr>
-          <w:ilvl w:val="0"/>
-          <w:numId w:val="2"/>
-        </w:numPr>
-        <w:rPr>
-          <w:b/>
-          <w:bCs/>
-        </w:rPr>
-      </w:pPr>
-      <w:r>
-        <w:t>Administrador</w:t>
-      </w:r>
-    </w:p>
-    <w:p>
-      <w:pPr>
-        <w:rPr>
-          <w:b/>
-          <w:bCs/>
-        </w:rPr>
-      </w:pPr>
-      <w:r>
-        <w:rPr>
-          <w:b/>
-          <w:bCs/>
-        </w:rPr>
-        <w:t>Precondiciones:</w:t>
-      </w:r>
-    </w:p>
-    <w:p>
-      <w:pPr>
-        <w:pStyle w:val="Prrafodelista"/>
-        <w:numPr>
-          <w:ilvl w:val="0"/>
-          <w:numId w:val="2"/>
-        </w:numPr>
-      </w:pPr>
-      <w:r>
-        <w:t>El administrador debe tener la sesión activa.</w:t>
-      </w:r>
-    </w:p>
-    <w:p>
-      <w:pPr>
-        <w:pStyle w:val="Prrafodelista"/>
-        <w:numPr>
-          <w:ilvl w:val="0"/>
-          <w:numId w:val="2"/>
-        </w:numPr>
-        <w:rPr>
-          <w:b/>
-          <w:bCs/>
-        </w:rPr>
-      </w:pPr>
-      <w:r>
-        <w:lastRenderedPageBreak/>
-        <w:t>El libro debe estar registrado.</w:t>
-      </w:r>
-    </w:p>
-    <w:p>
-      <w:pPr>
-        <w:rPr>
-          <w:b/>
-          <w:bCs/>
-        </w:rPr>
-      </w:pPr>
-      <w:r>
-        <w:rPr>
-          <w:b/>
-          <w:bCs/>
-        </w:rPr>
-        <w:t>Flujo</w:t>
-      </w:r>
-      <w:r>
-        <w:rPr>
-          <w:b/>
-          <w:bCs/>
-        </w:rPr>
-        <w:t xml:space="preserve"> principal</w:t>
-      </w:r>
-      <w:r>
-        <w:rPr>
-          <w:b/>
-          <w:bCs/>
-        </w:rPr>
-        <w:t>:</w:t>
-      </w:r>
-    </w:p>
-    <w:p>
-      <w:pPr>
-        <w:pStyle w:val="Prrafodelista"/>
-        <w:numPr>
-          <w:ilvl w:val="0"/>
-          <w:numId w:val="39"/>
-        </w:numPr>
-      </w:pPr>
-      <w:r>
-        <w:t xml:space="preserve">El administrador accede a la </w:t>
-      </w:r>
-      <w:r>
-        <w:t>página</w:t>
-      </w:r>
-      <w:r>
-        <w:t xml:space="preserve"> principal.</w:t>
-      </w:r>
-    </w:p>
-    <w:p>
-      <w:pPr>
-        <w:pStyle w:val="Prrafodelista"/>
-        <w:numPr>
-          <w:ilvl w:val="0"/>
-          <w:numId w:val="39"/>
-        </w:numPr>
-      </w:pPr>
-      <w:r>
-        <w:t>El administrador busca el libro.</w:t>
-      </w:r>
-    </w:p>
-    <w:p>
-      <w:pPr>
-        <w:pStyle w:val="Prrafodelista"/>
-        <w:numPr>
-          <w:ilvl w:val="0"/>
-          <w:numId w:val="39"/>
-        </w:numPr>
-      </w:pPr>
-      <w:r>
-        <w:t>El administrador selecciona el libro.</w:t>
-      </w:r>
-    </w:p>
-    <w:p>
-      <w:pPr>
-        <w:pStyle w:val="Prrafodelista"/>
-        <w:numPr>
-          <w:ilvl w:val="0"/>
-          <w:numId w:val="39"/>
-        </w:numPr>
-      </w:pPr>
-      <w:r>
-        <w:t>El administrador selecciona el botón Eliminar.</w:t>
-      </w:r>
-    </w:p>
-    <w:p>
-      <w:pPr>
-        <w:pStyle w:val="Prrafodelista"/>
-        <w:numPr>
-          <w:ilvl w:val="0"/>
-          <w:numId w:val="39"/>
-        </w:numPr>
-      </w:pPr>
-      <w:r>
-        <w:t xml:space="preserve">El sistema </w:t>
-      </w:r>
-      <w:r>
-        <w:t>pregunta al administrador.</w:t>
-      </w:r>
-    </w:p>
-    <w:p>
-      <w:pPr>
-        <w:pStyle w:val="Prrafodelista"/>
-        <w:numPr>
-          <w:ilvl w:val="0"/>
-          <w:numId w:val="39"/>
-        </w:numPr>
-      </w:pPr>
-      <w:r>
-        <w:t xml:space="preserve">El administrador confirma la </w:t>
-      </w:r>
-      <w:r>
-        <w:t>eliminación</w:t>
-      </w:r>
-      <w:r>
-        <w:t>.</w:t>
-      </w:r>
-    </w:p>
-    <w:p>
-      <w:pPr>
-        <w:pStyle w:val="Prrafodelista"/>
-        <w:numPr>
-          <w:ilvl w:val="0"/>
-          <w:numId w:val="39"/>
-        </w:numPr>
-      </w:pPr>
-      <w:r>
-        <w:t>El sistema elimina el libro.</w:t>
-      </w:r>
-    </w:p>
-    <w:p>
-      <w:pPr>
-        <w:pStyle w:val="Prrafodelista"/>
-        <w:numPr>
-          <w:ilvl w:val="0"/>
-          <w:numId w:val="39"/>
-        </w:numPr>
-      </w:pPr>
-      <w:r>
-        <w:t>El sistema muestra mensaje de eliminación exitosa.</w:t>
-      </w:r>
-    </w:p>
-    <w:p>
-      <w:pPr>
-        <w:rPr>
-          <w:b/>
-          <w:bCs/>
-        </w:rPr>
-      </w:pPr>
-      <w:r>
-        <w:rPr>
-          <w:b/>
-          <w:bCs/>
-        </w:rPr>
-        <w:t>Flujos alternativos:</w:t>
-      </w:r>
-    </w:p>
-    <w:p>
-      <w:pPr>
-        <w:rPr>
-          <w:b/>
-          <w:bCs/>
-        </w:rPr>
-      </w:pPr>
-      <w:r>
-        <w:rPr>
-          <w:b/>
-          <w:bCs/>
-        </w:rPr>
-        <w:t xml:space="preserve">A1 – </w:t>
-      </w:r>
-      <w:r>
-        <w:rPr>
-          <w:b/>
-          <w:bCs/>
-        </w:rPr>
-        <w:t>Cancelación de la eliminación</w:t>
-      </w:r>
-    </w:p>
-    <w:p>
-      <w:pPr>
-        <w:pStyle w:val="Prrafodelista"/>
-        <w:numPr>
-          <w:ilvl w:val="0"/>
-          <w:numId w:val="68"/>
-        </w:numPr>
-      </w:pPr>
-      <w:r>
-        <w:t>El sistema solicita confirmación antes de eliminar el libro.</w:t>
-      </w:r>
-    </w:p>
-    <w:p>
-      <w:pPr>
-        <w:pStyle w:val="Prrafodelista"/>
-        <w:numPr>
-          <w:ilvl w:val="0"/>
-          <w:numId w:val="68"/>
-        </w:numPr>
-      </w:pPr>
-      <w:r>
-        <w:t>El administrador cancela la operación.</w:t>
-      </w:r>
-    </w:p>
-    <w:p>
-      <w:pPr>
-        <w:pStyle w:val="Prrafodelista"/>
-        <w:numPr>
-          <w:ilvl w:val="0"/>
-          <w:numId w:val="68"/>
-        </w:numPr>
-      </w:pPr>
-      <w:r>
-        <w:t>El sistema cancela el proceso y regresa al menú principal.</w:t>
-      </w:r>
-    </w:p>
-    <w:p>
-      <w:pPr>
-        <w:rPr>
-          <w:b/>
-          <w:bCs/>
-        </w:rPr>
-      </w:pPr>
-      <w:r>
-        <w:rPr>
-          <w:b/>
-          <w:bCs/>
-        </w:rPr>
-        <w:t>Postcondiciones:</w:t>
-      </w:r>
-    </w:p>
-    <w:p>
-      <w:pPr>
-        <w:pStyle w:val="Prrafodelista"/>
-        <w:numPr>
-          <w:ilvl w:val="0"/>
-          <w:numId w:val="40"/>
-        </w:numPr>
-      </w:pPr>
-      <w:r>
-        <w:t>El libro es</w:t>
-      </w:r>
-      <w:r>
-        <w:t xml:space="preserve"> eliminado</w:t>
-      </w:r>
-      <w:r>
-        <w:t xml:space="preserve"> del sistema.</w:t>
-      </w:r>
-    </w:p>
-    <w:p>
-      <w:pPr>
-        <w:rPr>
-          <w:b/>
-          <w:bCs/>
-        </w:rPr>
-      </w:pPr>
-      <w:r>
-        <w:rPr>
-          <w:b/>
-          <w:bCs/>
-        </w:rPr>
-        <w:t>Criterios de aceptación:</w:t>
-      </w:r>
-    </w:p>
-    <w:p>
-      <w:pPr>
-        <w:pStyle w:val="Prrafodelista"/>
-        <w:numPr>
-          <w:ilvl w:val="0"/>
           <w:numId w:val="69"/>
         </w:numPr>
       </w:pPr>
@@ -3362,7 +2927,6 @@
           <w:b/>
           <w:bCs/>
         </w:rPr>
-        <w:lastRenderedPageBreak/>
         <w:t>RF – 005: Listar libros</w:t>
       </w:r>
     </w:p>
@@ -3792,393 +3356,429 @@
           <w:b/>
           <w:bCs/>
         </w:rPr>
+        <w:t>RF – 00</w:t>
+      </w:r>
+      <w:r>
+        <w:rPr>
+          <w:b/>
+          <w:bCs/>
+        </w:rPr>
+        <w:t>6</w:t>
+      </w:r>
+      <w:r>
+        <w:rPr>
+          <w:b/>
+          <w:bCs/>
+        </w:rPr>
+        <w:t xml:space="preserve">: </w:t>
+      </w:r>
+      <w:r>
+        <w:rPr>
+          <w:b/>
+          <w:bCs/>
+        </w:rPr>
+        <w:t>Actualizar el estado</w:t>
+      </w:r>
+    </w:p>
+    <w:p>
+      <w:pPr>
+        <w:rPr>
+          <w:b/>
+          <w:bCs/>
+        </w:rPr>
+      </w:pPr>
+      <w:r>
+        <w:rPr>
+          <w:b/>
+          <w:bCs/>
+        </w:rPr>
+        <w:t>Descripción:</w:t>
+      </w:r>
+    </w:p>
+    <w:p>
+      <w:r>
+        <w:t>El sistema debe actualizar el estado de un libro, indicando si se encuentra disponible, prestado u otro estado definido, con el fin de mantener actualizado el catálogo de la biblioteca.</w:t>
+      </w:r>
+    </w:p>
+    <w:p>
+      <w:pPr>
+        <w:rPr>
+          <w:b/>
+          <w:bCs/>
+        </w:rPr>
+      </w:pPr>
+      <w:r>
+        <w:rPr>
+          <w:b/>
+          <w:bCs/>
+        </w:rPr>
+        <w:t>Actor:</w:t>
+      </w:r>
+    </w:p>
+    <w:p>
+      <w:pPr>
+        <w:pStyle w:val="Prrafodelista"/>
+        <w:numPr>
+          <w:ilvl w:val="0"/>
+          <w:numId w:val="2"/>
+        </w:numPr>
+      </w:pPr>
+      <w:r>
+        <w:t>Sistema.</w:t>
+      </w:r>
+    </w:p>
+    <w:p>
+      <w:pPr>
+        <w:pStyle w:val="Prrafodelista"/>
+        <w:numPr>
+          <w:ilvl w:val="0"/>
+          <w:numId w:val="2"/>
+        </w:numPr>
+      </w:pPr>
+      <w:r>
+        <w:t>Usuario</w:t>
+      </w:r>
+    </w:p>
+    <w:p>
+      <w:pPr>
+        <w:rPr>
+          <w:b/>
+          <w:bCs/>
+        </w:rPr>
+      </w:pPr>
+      <w:r>
+        <w:rPr>
+          <w:b/>
+          <w:bCs/>
+        </w:rPr>
+        <w:t>Precondiciones:</w:t>
+      </w:r>
+    </w:p>
+    <w:p>
+      <w:pPr>
+        <w:pStyle w:val="Prrafodelista"/>
+        <w:numPr>
+          <w:ilvl w:val="0"/>
+          <w:numId w:val="2"/>
+        </w:numPr>
+        <w:rPr>
+          <w:b/>
+          <w:bCs/>
+        </w:rPr>
+      </w:pPr>
+      <w:r>
+        <w:t>Debe haber libros registrados.</w:t>
+      </w:r>
+    </w:p>
+    <w:p>
+      <w:pPr>
+        <w:pStyle w:val="Prrafodelista"/>
+        <w:numPr>
+          <w:ilvl w:val="0"/>
+          <w:numId w:val="2"/>
+        </w:numPr>
+        <w:rPr>
+          <w:b/>
+          <w:bCs/>
+        </w:rPr>
+      </w:pPr>
+      <w:r>
+        <w:t>Funcionalidad activa.</w:t>
+      </w:r>
+    </w:p>
+    <w:p>
+      <w:pPr>
+        <w:rPr>
+          <w:b/>
+          <w:bCs/>
+        </w:rPr>
+      </w:pPr>
+      <w:r>
+        <w:rPr>
+          <w:b/>
+          <w:bCs/>
+        </w:rPr>
+        <w:t xml:space="preserve">Flujo Principal: </w:t>
+      </w:r>
+    </w:p>
+    <w:p>
+      <w:pPr>
+        <w:pStyle w:val="Prrafodelista"/>
+        <w:numPr>
+          <w:ilvl w:val="0"/>
+          <w:numId w:val="14"/>
+        </w:numPr>
+      </w:pPr>
+      <w:r>
+        <w:t>Un usuario ingresa al aplicativo.</w:t>
+      </w:r>
+    </w:p>
+    <w:p>
+      <w:pPr>
+        <w:pStyle w:val="Prrafodelista"/>
+        <w:numPr>
+          <w:ilvl w:val="0"/>
+          <w:numId w:val="14"/>
+        </w:numPr>
+      </w:pPr>
+      <w:r>
+        <w:t>El usuario presta o devuelve un libro.</w:t>
+      </w:r>
+    </w:p>
+    <w:p>
+      <w:pPr>
+        <w:pStyle w:val="Prrafodelista"/>
+        <w:numPr>
+          <w:ilvl w:val="0"/>
+          <w:numId w:val="14"/>
+        </w:numPr>
+      </w:pPr>
+      <w:r>
+        <w:t>El sistema realiza la actualización del estado</w:t>
+      </w:r>
+      <w:r>
+        <w:t>.</w:t>
+      </w:r>
+    </w:p>
+    <w:p>
+      <w:pPr>
+        <w:pStyle w:val="Prrafodelista"/>
+        <w:numPr>
+          <w:ilvl w:val="0"/>
+          <w:numId w:val="14"/>
+        </w:numPr>
+      </w:pPr>
+      <w:r>
+        <w:t>El sistema notifica a los usuarios de este cambio.</w:t>
+      </w:r>
+    </w:p>
+    <w:p>
+      <w:pPr>
+        <w:rPr>
+          <w:b/>
+          <w:bCs/>
+        </w:rPr>
+      </w:pPr>
+      <w:r>
+        <w:rPr>
+          <w:b/>
+          <w:bCs/>
+        </w:rPr>
+        <w:t>Flujos alternativos:</w:t>
+      </w:r>
+    </w:p>
+    <w:p>
+      <w:pPr>
+        <w:rPr>
+          <w:b/>
+          <w:bCs/>
+        </w:rPr>
+      </w:pPr>
+      <w:r>
+        <w:rPr>
+          <w:b/>
+          <w:bCs/>
+        </w:rPr>
+        <w:t xml:space="preserve">A1 </w:t>
+      </w:r>
+      <w:r>
+        <w:rPr>
+          <w:b/>
+          <w:bCs/>
+        </w:rPr>
+        <w:t>–</w:t>
+      </w:r>
+      <w:r>
+        <w:rPr>
+          <w:b/>
+          <w:bCs/>
+        </w:rPr>
+        <w:t xml:space="preserve"> </w:t>
+      </w:r>
+      <w:r>
+        <w:rPr>
+          <w:b/>
+          <w:bCs/>
+        </w:rPr>
+        <w:t>Usuario hizo préstamo del libro</w:t>
+      </w:r>
+    </w:p>
+    <w:p>
+      <w:pPr>
+        <w:pStyle w:val="Prrafodelista"/>
+        <w:numPr>
+          <w:ilvl w:val="0"/>
+          <w:numId w:val="52"/>
+        </w:numPr>
+      </w:pPr>
+      <w:r>
+        <w:t>El usuario presta el libro.</w:t>
+      </w:r>
+    </w:p>
+    <w:p>
+      <w:pPr>
+        <w:pStyle w:val="Prrafodelista"/>
+        <w:numPr>
+          <w:ilvl w:val="0"/>
+          <w:numId w:val="52"/>
+        </w:numPr>
+      </w:pPr>
+      <w:r>
+        <w:t xml:space="preserve">El sistema </w:t>
+      </w:r>
+      <w:r>
+        <w:t>actualiza el estado del libro.</w:t>
+      </w:r>
+    </w:p>
+    <w:p>
+      <w:pPr>
+        <w:pStyle w:val="Prrafodelista"/>
+        <w:numPr>
+          <w:ilvl w:val="0"/>
+          <w:numId w:val="52"/>
+        </w:numPr>
+      </w:pPr>
+      <w:r>
+        <w:t>El sistema notifica a los usuarios</w:t>
+      </w:r>
+      <w:r>
+        <w:t>.</w:t>
+      </w:r>
+    </w:p>
+    <w:p>
+      <w:pPr>
+        <w:rPr>
+          <w:b/>
+          <w:bCs/>
+        </w:rPr>
+      </w:pPr>
+      <w:r>
+        <w:rPr>
+          <w:b/>
+          <w:bCs/>
+        </w:rPr>
+        <w:t>A2 – Usuario devuelve el libro</w:t>
+      </w:r>
+    </w:p>
+    <w:p>
+      <w:pPr>
+        <w:pStyle w:val="Prrafodelista"/>
+        <w:numPr>
+          <w:ilvl w:val="0"/>
+          <w:numId w:val="70"/>
+        </w:numPr>
+      </w:pPr>
+      <w:r>
+        <w:t>El usuario devuelve el libro.</w:t>
+      </w:r>
+    </w:p>
+    <w:p>
+      <w:pPr>
+        <w:pStyle w:val="Prrafodelista"/>
+        <w:numPr>
+          <w:ilvl w:val="0"/>
+          <w:numId w:val="70"/>
+        </w:numPr>
+      </w:pPr>
+      <w:r>
+        <w:t xml:space="preserve">El sistema </w:t>
+      </w:r>
+      <w:r>
+        <w:t>actualiza el estado del libro.</w:t>
+      </w:r>
+    </w:p>
+    <w:p>
+      <w:pPr>
+        <w:pStyle w:val="Prrafodelista"/>
+        <w:numPr>
+          <w:ilvl w:val="0"/>
+          <w:numId w:val="70"/>
+        </w:numPr>
+      </w:pPr>
+      <w:r>
+        <w:t>El sistema notifica a los usuarios</w:t>
+      </w:r>
+      <w:r>
+        <w:t>.</w:t>
+      </w:r>
+    </w:p>
+    <w:p>
+      <w:pPr>
+        <w:rPr>
+          <w:b/>
+          <w:bCs/>
+        </w:rPr>
+      </w:pPr>
+      <w:r>
+        <w:rPr>
+          <w:b/>
+          <w:bCs/>
+        </w:rPr>
+        <w:t>Postcondiciones:</w:t>
+      </w:r>
+    </w:p>
+    <w:p>
+      <w:pPr>
+        <w:pStyle w:val="Prrafodelista"/>
+        <w:numPr>
+          <w:ilvl w:val="0"/>
+          <w:numId w:val="16"/>
+        </w:numPr>
+      </w:pPr>
+      <w:r>
+        <w:t>El libro queda actualizado con el estado.</w:t>
+      </w:r>
+    </w:p>
+    <w:p>
+      <w:pPr>
+        <w:rPr>
+          <w:b/>
+          <w:bCs/>
+        </w:rPr>
+      </w:pPr>
+      <w:r>
+        <w:rPr>
+          <w:b/>
+          <w:bCs/>
+        </w:rPr>
+        <w:t>Criterios de aceptación:</w:t>
+      </w:r>
+    </w:p>
+    <w:p>
+      <w:pPr>
+        <w:pStyle w:val="Prrafodelista"/>
+        <w:numPr>
+          <w:ilvl w:val="0"/>
+          <w:numId w:val="53"/>
+        </w:numPr>
+      </w:pPr>
+      <w:r>
+        <w:t>El sistema debe validar que el libro exista antes de permitir la actualización.</w:t>
+      </w:r>
+    </w:p>
+    <w:p>
+      <w:pPr>
+        <w:pStyle w:val="Prrafodelista"/>
+        <w:numPr>
+          <w:ilvl w:val="0"/>
+          <w:numId w:val="53"/>
+        </w:numPr>
+      </w:pPr>
+      <w:r>
+        <w:t>El sistema debe permitir seleccionar únicamente estados válidos definidos en el sistema.</w:t>
+      </w:r>
+    </w:p>
+    <w:p>
+      <w:pPr>
+        <w:pStyle w:val="Prrafodelista"/>
+        <w:numPr>
+          <w:ilvl w:val="0"/>
+          <w:numId w:val="53"/>
+        </w:numPr>
+      </w:pPr>
+      <w:r>
         <w:lastRenderedPageBreak/>
-        <w:t>RF – 00</w:t>
-      </w:r>
-      <w:r>
-        <w:rPr>
-          <w:b/>
-          <w:bCs/>
-        </w:rPr>
-        <w:t>6</w:t>
-      </w:r>
-      <w:r>
-        <w:rPr>
-          <w:b/>
-          <w:bCs/>
-        </w:rPr>
-        <w:t xml:space="preserve">: </w:t>
-      </w:r>
-      <w:r>
-        <w:rPr>
-          <w:b/>
-          <w:bCs/>
-        </w:rPr>
-        <w:t>Actualizar el estado</w:t>
-      </w:r>
-    </w:p>
-    <w:p>
-      <w:pPr>
-        <w:rPr>
-          <w:b/>
-          <w:bCs/>
-        </w:rPr>
-      </w:pPr>
-      <w:r>
-        <w:rPr>
-          <w:b/>
-          <w:bCs/>
-        </w:rPr>
-        <w:t>Descripción:</w:t>
-      </w:r>
-    </w:p>
-    <w:p>
-      <w:r>
-        <w:t>El sistema debe actualizar el estado de un libro, indicando si se encuentra disponible, prestado u otro estado definido, con el fin de mantener actualizado el catálogo de la biblioteca.</w:t>
-      </w:r>
-    </w:p>
-    <w:p>
-      <w:pPr>
-        <w:rPr>
-          <w:b/>
-          <w:bCs/>
-        </w:rPr>
-      </w:pPr>
-      <w:r>
-        <w:rPr>
-          <w:b/>
-          <w:bCs/>
-        </w:rPr>
-        <w:t>Actor:</w:t>
-      </w:r>
-    </w:p>
-    <w:p>
-      <w:pPr>
-        <w:pStyle w:val="Prrafodelista"/>
-        <w:numPr>
-          <w:ilvl w:val="0"/>
-          <w:numId w:val="2"/>
-        </w:numPr>
-      </w:pPr>
-      <w:r>
-        <w:t>Sistema.</w:t>
-      </w:r>
-    </w:p>
-    <w:p>
-      <w:pPr>
-        <w:pStyle w:val="Prrafodelista"/>
-        <w:numPr>
-          <w:ilvl w:val="0"/>
-          <w:numId w:val="2"/>
-        </w:numPr>
-      </w:pPr>
-      <w:r>
-        <w:t>Usuario</w:t>
-      </w:r>
-    </w:p>
-    <w:p>
-      <w:pPr>
-        <w:rPr>
-          <w:b/>
-          <w:bCs/>
-        </w:rPr>
-      </w:pPr>
-      <w:r>
-        <w:rPr>
-          <w:b/>
-          <w:bCs/>
-        </w:rPr>
-        <w:t>Precondiciones:</w:t>
-      </w:r>
-    </w:p>
-    <w:p>
-      <w:pPr>
-        <w:pStyle w:val="Prrafodelista"/>
-        <w:numPr>
-          <w:ilvl w:val="0"/>
-          <w:numId w:val="2"/>
-        </w:numPr>
-        <w:rPr>
-          <w:b/>
-          <w:bCs/>
-        </w:rPr>
-      </w:pPr>
-      <w:r>
-        <w:t>Debe haber libros registrados.</w:t>
-      </w:r>
-    </w:p>
-    <w:p>
-      <w:pPr>
-        <w:pStyle w:val="Prrafodelista"/>
-        <w:numPr>
-          <w:ilvl w:val="0"/>
-          <w:numId w:val="2"/>
-        </w:numPr>
-        <w:rPr>
-          <w:b/>
-          <w:bCs/>
-        </w:rPr>
-      </w:pPr>
-      <w:r>
-        <w:t>Funcionalidad activa.</w:t>
-      </w:r>
-    </w:p>
-    <w:p>
-      <w:pPr>
-        <w:rPr>
-          <w:b/>
-          <w:bCs/>
-        </w:rPr>
-      </w:pPr>
-      <w:r>
-        <w:rPr>
-          <w:b/>
-          <w:bCs/>
-        </w:rPr>
-        <w:t xml:space="preserve">Flujo Principal: </w:t>
-      </w:r>
-    </w:p>
-    <w:p>
-      <w:pPr>
-        <w:pStyle w:val="Prrafodelista"/>
-        <w:numPr>
-          <w:ilvl w:val="0"/>
-          <w:numId w:val="14"/>
-        </w:numPr>
-      </w:pPr>
-      <w:r>
-        <w:t>Un usuario ingresa al aplicativo.</w:t>
-      </w:r>
-    </w:p>
-    <w:p>
-      <w:pPr>
-        <w:pStyle w:val="Prrafodelista"/>
-        <w:numPr>
-          <w:ilvl w:val="0"/>
-          <w:numId w:val="14"/>
-        </w:numPr>
-      </w:pPr>
-      <w:r>
-        <w:t>El usuario presta o devuelve un libro.</w:t>
-      </w:r>
-    </w:p>
-    <w:p>
-      <w:pPr>
-        <w:pStyle w:val="Prrafodelista"/>
-        <w:numPr>
-          <w:ilvl w:val="0"/>
-          <w:numId w:val="14"/>
-        </w:numPr>
-      </w:pPr>
-      <w:r>
-        <w:t>El sistema realiza la actualización del estado</w:t>
-      </w:r>
-      <w:r>
-        <w:t>.</w:t>
-      </w:r>
-    </w:p>
-    <w:p>
-      <w:pPr>
-        <w:pStyle w:val="Prrafodelista"/>
-        <w:numPr>
-          <w:ilvl w:val="0"/>
-          <w:numId w:val="14"/>
-        </w:numPr>
-      </w:pPr>
-      <w:r>
-        <w:t>El sistema notifica a los usuarios de este cambio.</w:t>
-      </w:r>
-    </w:p>
-    <w:p>
-      <w:pPr>
-        <w:rPr>
-          <w:b/>
-          <w:bCs/>
-        </w:rPr>
-      </w:pPr>
-      <w:r>
-        <w:rPr>
-          <w:b/>
-          <w:bCs/>
-        </w:rPr>
-        <w:t>Flujos alternativos:</w:t>
-      </w:r>
-    </w:p>
-    <w:p>
-      <w:pPr>
-        <w:rPr>
-          <w:b/>
-          <w:bCs/>
-        </w:rPr>
-      </w:pPr>
-      <w:r>
-        <w:rPr>
-          <w:b/>
-          <w:bCs/>
-        </w:rPr>
-        <w:t xml:space="preserve">A1 </w:t>
-      </w:r>
-      <w:r>
-        <w:rPr>
-          <w:b/>
-          <w:bCs/>
-        </w:rPr>
-        <w:t>–</w:t>
-      </w:r>
-      <w:r>
-        <w:rPr>
-          <w:b/>
-          <w:bCs/>
-        </w:rPr>
-        <w:t xml:space="preserve"> </w:t>
-      </w:r>
-      <w:r>
-        <w:rPr>
-          <w:b/>
-          <w:bCs/>
-        </w:rPr>
-        <w:t>Usuario hizo préstamo del libro</w:t>
-      </w:r>
-    </w:p>
-    <w:p>
-      <w:pPr>
-        <w:pStyle w:val="Prrafodelista"/>
-        <w:numPr>
-          <w:ilvl w:val="0"/>
-          <w:numId w:val="52"/>
-        </w:numPr>
-      </w:pPr>
-      <w:r>
-        <w:t>El usuario presta el libro.</w:t>
-      </w:r>
-    </w:p>
-    <w:p>
-      <w:pPr>
-        <w:pStyle w:val="Prrafodelista"/>
-        <w:numPr>
-          <w:ilvl w:val="0"/>
-          <w:numId w:val="52"/>
-        </w:numPr>
-      </w:pPr>
-      <w:r>
-        <w:t xml:space="preserve">El sistema </w:t>
-      </w:r>
-      <w:r>
-        <w:t>actualiza el estado del libro.</w:t>
-      </w:r>
-    </w:p>
-    <w:p>
-      <w:pPr>
-        <w:pStyle w:val="Prrafodelista"/>
-        <w:numPr>
-          <w:ilvl w:val="0"/>
-          <w:numId w:val="52"/>
-        </w:numPr>
-      </w:pPr>
-      <w:r>
-        <w:t>El sistema notifica a los usuarios</w:t>
-      </w:r>
-      <w:r>
-        <w:t>.</w:t>
-      </w:r>
-    </w:p>
-    <w:p>
-      <w:pPr>
-        <w:rPr>
-          <w:b/>
-          <w:bCs/>
-        </w:rPr>
-      </w:pPr>
-      <w:r>
-        <w:rPr>
-          <w:b/>
-          <w:bCs/>
-        </w:rPr>
-        <w:t>A2 – Usuario devuelve el libro</w:t>
-      </w:r>
-    </w:p>
-    <w:p>
-      <w:pPr>
-        <w:pStyle w:val="Prrafodelista"/>
-        <w:numPr>
-          <w:ilvl w:val="0"/>
-          <w:numId w:val="70"/>
-        </w:numPr>
-      </w:pPr>
-      <w:r>
-        <w:t>El usuario devuelve el libro.</w:t>
-      </w:r>
-    </w:p>
-    <w:p>
-      <w:pPr>
-        <w:pStyle w:val="Prrafodelista"/>
-        <w:numPr>
-          <w:ilvl w:val="0"/>
-          <w:numId w:val="70"/>
-        </w:numPr>
-      </w:pPr>
-      <w:r>
-        <w:t xml:space="preserve">El sistema </w:t>
-      </w:r>
-      <w:r>
-        <w:t>actualiza el estado del libro.</w:t>
-      </w:r>
-    </w:p>
-    <w:p>
-      <w:pPr>
-        <w:pStyle w:val="Prrafodelista"/>
-        <w:numPr>
-          <w:ilvl w:val="0"/>
-          <w:numId w:val="70"/>
-        </w:numPr>
-      </w:pPr>
-      <w:r>
-        <w:t>El sistema notifica a los usuarios</w:t>
-      </w:r>
-      <w:r>
-        <w:t>.</w:t>
-      </w:r>
-    </w:p>
-    <w:p>
-      <w:pPr>
-        <w:rPr>
-          <w:b/>
-          <w:bCs/>
-        </w:rPr>
-      </w:pPr>
-      <w:r>
-        <w:rPr>
-          <w:b/>
-          <w:bCs/>
-        </w:rPr>
-        <w:t>Postcondiciones:</w:t>
-      </w:r>
-    </w:p>
-    <w:p>
-      <w:pPr>
-        <w:pStyle w:val="Prrafodelista"/>
-        <w:numPr>
-          <w:ilvl w:val="0"/>
-          <w:numId w:val="16"/>
-        </w:numPr>
-      </w:pPr>
-      <w:r>
-        <w:t>El libro queda actualizado con el estado.</w:t>
-      </w:r>
-    </w:p>
-    <w:p>
-      <w:pPr>
-        <w:rPr>
-          <w:b/>
-          <w:bCs/>
-        </w:rPr>
-      </w:pPr>
-      <w:r>
-        <w:rPr>
-          <w:b/>
-          <w:bCs/>
-        </w:rPr>
-        <w:t>Criterios de aceptación:</w:t>
+        <w:t>El sistema debe mostrar un mensaje de confirmación cuando la actualización se realice correctamente.</w:t>
       </w:r>
     </w:p>
     <w:p>
@@ -4190,48 +3790,9 @@
         </w:numPr>
       </w:pPr>
       <w:r>
-        <w:t>El sistema debe validar que el libro exista antes de permitir la actualización.</w:t>
-      </w:r>
-    </w:p>
-    <w:p>
-      <w:pPr>
-        <w:pStyle w:val="Prrafodelista"/>
-        <w:numPr>
-          <w:ilvl w:val="0"/>
-          <w:numId w:val="53"/>
-        </w:numPr>
-      </w:pPr>
-      <w:r>
-        <w:t>El sistema debe permitir seleccionar únicamente estados válidos definidos en el sistema.</w:t>
-      </w:r>
-    </w:p>
-    <w:p>
-      <w:pPr>
-        <w:pStyle w:val="Prrafodelista"/>
-        <w:numPr>
-          <w:ilvl w:val="0"/>
-          <w:numId w:val="53"/>
-        </w:numPr>
-      </w:pPr>
-      <w:r>
-        <w:t>El sistema debe mostrar un mensaje de confirmación cuando la actualización se realice correctamente.</w:t>
-      </w:r>
-    </w:p>
-    <w:p>
-      <w:pPr>
-        <w:pStyle w:val="Prrafodelista"/>
-        <w:numPr>
-          <w:ilvl w:val="0"/>
-          <w:numId w:val="53"/>
-        </w:numPr>
-      </w:pPr>
-      <w:r>
         <w:t>El sistema debe mostrar mensajes de error claros cuando ocurra algún problema durante la operación.</w:t>
       </w:r>
     </w:p>
-    <w:p/>
-    <w:p/>
-    <w:p/>
     <w:p/>
     <w:p>
       <w:pPr>
@@ -4603,6 +4164,7 @@
         </w:numPr>
       </w:pPr>
       <w:r>
+        <w:lastRenderedPageBreak/>
         <w:t>El sistema debe mostrar recomendaciones relacionadas con la búsqueda o historial del usuario.</w:t>
       </w:r>
     </w:p>
@@ -4618,15 +4180,6 @@
         <w:t>El sistema debe mostrar recomendaciones incluso si no se encuentra el libro buscado.</w:t>
       </w:r>
     </w:p>
-    <w:p/>
-    <w:p>
-      <w:pPr>
-        <w:rPr>
-          <w:b/>
-          <w:bCs/>
-        </w:rPr>
-      </w:pPr>
-    </w:p>
     <w:p>
       <w:pPr>
         <w:rPr>
@@ -5074,6 +4627,7 @@
         </w:numPr>
       </w:pPr>
       <w:r>
+        <w:lastRenderedPageBreak/>
         <w:t>El sistema registra la notificación.</w:t>
       </w:r>
     </w:p>
@@ -5089,7 +4643,6 @@
           <w:b/>
           <w:bCs/>
         </w:rPr>
-        <w:lastRenderedPageBreak/>
         <w:t>Criterios de aceptación:</w:t>
       </w:r>
     </w:p>

</xml_diff>